<commit_message>
Superscript exponents in exact p-values
</commit_message>
<xml_diff>
--- a/paper/submission/Table6.docx
+++ b/paper/submission/Table6.docx
@@ -569,7 +569,7 @@
                 <w:i w:val="0"/>
                 <w:sz w:val="18"/>
               </w:rPr>
-              <w:t>9.3 × 10⁻6</w:t>
+              <w:t>9.3 × 10⁻⁶</w:t>
             </w:r>
           </w:p>
         </w:tc>
@@ -589,7 +589,7 @@
                 <w:i w:val="0"/>
                 <w:sz w:val="18"/>
               </w:rPr>
-              <w:t>2.0 × 10⁻4</w:t>
+              <w:t>2.0 × 10⁻⁴</w:t>
             </w:r>
           </w:p>
         </w:tc>
@@ -733,7 +733,7 @@
                 <w:i w:val="0"/>
                 <w:sz w:val="18"/>
               </w:rPr>
-              <w:t>2.8 × 10⁻4</w:t>
+              <w:t>2.8 × 10⁻⁴</w:t>
             </w:r>
           </w:p>
         </w:tc>
@@ -1389,7 +1389,7 @@
                 <w:i w:val="0"/>
                 <w:sz w:val="18"/>
               </w:rPr>
-              <w:t>9.8 × 10⁻8</w:t>
+              <w:t>9.8 × 10⁻⁸</w:t>
             </w:r>
           </w:p>
         </w:tc>
@@ -1409,7 +1409,7 @@
                 <w:i w:val="0"/>
                 <w:sz w:val="18"/>
               </w:rPr>
-              <w:t>2.3 × 10⁻6</w:t>
+              <w:t>2.3 × 10⁻⁶</w:t>
             </w:r>
           </w:p>
         </w:tc>
@@ -1553,7 +1553,7 @@
                 <w:i w:val="0"/>
                 <w:sz w:val="18"/>
               </w:rPr>
-              <w:t>8.0 × 10⁻4</w:t>
+              <w:t>8.0 × 10⁻⁴</w:t>
             </w:r>
           </w:p>
         </w:tc>
@@ -1717,7 +1717,7 @@
                 <w:i w:val="0"/>
                 <w:sz w:val="18"/>
               </w:rPr>
-              <w:t>3.1 × 10⁻15</w:t>
+              <w:t>3.1 × 10⁻¹⁵</w:t>
             </w:r>
           </w:p>
         </w:tc>
@@ -1737,7 +1737,7 @@
                 <w:i w:val="0"/>
                 <w:sz w:val="18"/>
               </w:rPr>
-              <w:t>7.5 × 10⁻14</w:t>
+              <w:t>7.5 × 10⁻¹⁴</w:t>
             </w:r>
           </w:p>
         </w:tc>

</xml_diff>